<commit_message>
SAVEPOINT: Stage A web progress indicator\n\n- Busy overlay + spinner + toasts; disable Analyze/Apply during requests\n- Override checkbox visibility polish (bigger checkbox, bold label)\n- Font/size dropdowns synced with inputs\n- Docs: mark Stage A done; add Stage B job API plan\n\nDiff vs previous: UI now shows busy state and completion toasts; groundwork for future job-based progress.
</commit_message>
<xml_diff>
--- a/output/test2.docx
+++ b/output/test2.docx
@@ -15332,8 +15332,8 @@
     <w:rPr>
       <w:rFonts w:ascii="Times New Roman" w:hAnsi="Times New Roman"/>
       <w:b/>
-      <w:caps/>
-      <w:sz w:val="56"/>
+      <w:caps w:val="0"/>
+      <w:sz w:val="20"/>
     </w:rPr>
   </w:style>
   <w:style w:type="paragraph" w:customStyle="1" w:styleId="CoverSubtitle">
@@ -15342,9 +15342,9 @@
       <w:jc w:val="center"/>
     </w:pPr>
     <w:rPr>
-      <w:rFonts w:ascii="Times New Roman" w:hAnsi="Times New Roman"/>
-      <w:b w:val="0"/>
-      <w:caps/>
+      <w:rFonts w:ascii="Palatino Linotype" w:hAnsi="Palatino Linotype"/>
+      <w:b/>
+      <w:caps w:val="0"/>
       <w:sz w:val="36"/>
     </w:rPr>
   </w:style>
@@ -15354,10 +15354,10 @@
       <w:jc w:val="center"/>
     </w:pPr>
     <w:rPr>
-      <w:rFonts w:ascii="Times New Roman" w:hAnsi="Times New Roman"/>
-      <w:b w:val="0"/>
+      <w:rFonts w:ascii="PT Serif" w:hAnsi="PT Serif"/>
+      <w:b/>
       <w:caps w:val="0"/>
-      <w:sz w:val="32"/>
+      <w:sz w:val="80"/>
     </w:rPr>
   </w:style>
 </w:styles>

</xml_diff>

<commit_message>
chore: first commit on AI server
</commit_message>
<xml_diff>
--- a/output/test2.docx
+++ b/output/test2.docx
@@ -15331,9 +15331,9 @@
     </w:pPr>
     <w:rPr>
       <w:rFonts w:ascii="Times New Roman" w:hAnsi="Times New Roman"/>
-      <w:b/>
-      <w:caps w:val="0"/>
-      <w:sz w:val="20"/>
+      <w:b w:val="0"/>
+      <w:caps/>
+      <w:sz w:val="56"/>
     </w:rPr>
   </w:style>
   <w:style w:type="paragraph" w:customStyle="1" w:styleId="CoverSubtitle">
@@ -15342,9 +15342,9 @@
       <w:jc w:val="center"/>
     </w:pPr>
     <w:rPr>
-      <w:rFonts w:ascii="Palatino Linotype" w:hAnsi="Palatino Linotype"/>
-      <w:b/>
-      <w:caps w:val="0"/>
+      <w:rFonts w:ascii="Times New Roman" w:hAnsi="Times New Roman"/>
+      <w:b w:val="0"/>
+      <w:caps/>
       <w:sz w:val="36"/>
     </w:rPr>
   </w:style>
@@ -15354,10 +15354,10 @@
       <w:jc w:val="center"/>
     </w:pPr>
     <w:rPr>
-      <w:rFonts w:ascii="PT Serif" w:hAnsi="PT Serif"/>
-      <w:b/>
+      <w:rFonts w:ascii="Times New Roman" w:hAnsi="Times New Roman"/>
+      <w:b w:val="0"/>
       <w:caps w:val="0"/>
-      <w:sz w:val="80"/>
+      <w:sz w:val="32"/>
     </w:rPr>
   </w:style>
 </w:styles>

</xml_diff>